<commit_message>
feat: configurar captura de DNI por institución
</commit_message>
<xml_diff>
--- a/back/templates/PlantillaA.docx
+++ b/back/templates/PlantillaA.docx
@@ -84,7 +84,7 @@
           <w:bCs w:val="1"/>
           <w:rtl w:val="0"/>
         </w:rPr>
-        <w:t xml:space="preserve">DNI: </w:t>
+        <w:t xml:space="preserve">DNI: {DNI}</w:t>
       </w:r>
     </w:p>
     <w:p>
@@ -744,12 +744,12 @@
             <wp:extent cx="1910197" cy="1052779"/>
             <wp:effectExtent b="0" l="0" r="0" t="0"/>
             <wp:wrapNone/>
-            <wp:docPr id="5" name="image1.png"/>
+            <wp:docPr id="8" name="image2.png"/>
             <a:graphic>
               <a:graphicData uri="http://schemas.openxmlformats.org/drawingml/2006/picture">
                 <pic:pic>
                   <pic:nvPicPr>
-                    <pic:cNvPr id="0" name="image1.png"/>
+                    <pic:cNvPr id="0" name="image2.png"/>
                     <pic:cNvPicPr preferRelativeResize="0"/>
                   </pic:nvPicPr>
                   <pic:blipFill>
@@ -933,12 +933,12 @@
         <wp:inline distB="0" distT="0" distL="0" distR="0">
           <wp:extent cx="657462" cy="652463"/>
           <wp:effectExtent b="0" l="0" r="0" t="0"/>
-          <wp:docPr id="6" name="image2.png"/>
+          <wp:docPr id="10" name="image1.png"/>
           <a:graphic>
             <a:graphicData uri="http://schemas.openxmlformats.org/drawingml/2006/picture">
               <pic:pic>
                 <pic:nvPicPr>
-                  <pic:cNvPr id="0" name="image2.png"/>
+                  <pic:cNvPr id="0" name="image1.png"/>
                   <pic:cNvPicPr preferRelativeResize="0"/>
                 </pic:nvPicPr>
                 <pic:blipFill>
@@ -970,7 +970,7 @@
         <wp:inline distB="0" distT="0" distL="0" distR="0">
           <wp:extent cx="1633538" cy="514919"/>
           <wp:effectExtent b="0" l="0" r="0" t="0"/>
-          <wp:docPr id="7" name="image3.png"/>
+          <wp:docPr id="9" name="image3.png"/>
           <a:graphic>
             <a:graphicData uri="http://schemas.openxmlformats.org/drawingml/2006/picture">
               <pic:pic>
@@ -1286,6 +1286,20 @@
       <w:sz w:val="52"/>
       <w:szCs w:val="52"/>
     </w:rPr>
+  </w:style>
+  <w:style w:type="table" w:styleId="TableNormal" w:default="1">
+    <w:name w:val="TableNormal"/>
+    <w:tblPr>
+      <w:tblCellMar>
+        <w:top w:w="100.0" w:type="dxa"/>
+        <w:left w:w="100.0" w:type="dxa"/>
+        <w:bottom w:w="100.0" w:type="dxa"/>
+        <w:right w:w="100.0" w:type="dxa"/>
+      </w:tblCellMar>
+    </w:tblPr>
+  </w:style>
+  <w:style w:type="paragraph" w:styleId="Normal" w:default="1">
+    <w:name w:val="normal"/>
   </w:style>
   <w:style w:type="paragraph" w:styleId="Normal" w:default="1">
     <w:name w:val="normal"/>
@@ -1649,7 +1663,7 @@
 
 <file path=customXML/item1.xml><?xml version="1.0" encoding="utf-8"?>
 <go:gDocsCustomXmlDataStorage xmlns:go="http://customooxmlschemas.google.com/" xmlns:r="http://schemas.openxmlformats.org/officeDocument/2006/relationships" uri="GoogleDocsCustomDataVersion2">
-  <go:docsCustomData xmlns:go="http://customooxmlschemas.google.com/" roundtripDataSignature="AMtx7mgdCwS+iuQy/ZrRtmD85gs26MWc7A==">CgMxLjAyCGguZ2pkZ3hzMgloLjMwajB6bGw4AHIhMWpQYW9Ia2Nic3l4WDlZWmpXX1BiVm5xbGxfeGUxYThq</go:docsCustomData>
+  <go:docsCustomData xmlns:go="http://customooxmlschemas.google.com/" roundtripDataSignature="AMtx7mgTRw/QaFuqPpV/pGdlKndB6/9yBQ==">CgMxLjAyCGguZ2pkZ3hzMgloLjMwajB6bGw4AHIhMXREMGtzQlRsRjRGTHl2cTRNVlZEQWZibXFYNzZaSGpo</go:docsCustomData>
 </go:gDocsCustomXmlDataStorage>
 </file>
 

</xml_diff>